<commit_message>
Add Colab link and student details table to all documents
</commit_message>
<xml_diff>
--- a/2024BC26670_Sangitha_V_Concept_Note.docx
+++ b/2024BC26670_Sangitha_V_Concept_Note.docx
@@ -48,6 +48,115 @@
         <w:t>Dataset: Microsoft AdventureWorks customer data (DAT275x lab extract)</w:t>
       </w:r>
     </w:p>
+    <w:p>
+      <w:pPr>
+        <w:pStyle w:val="Heading1"/>
+      </w:pPr>
+      <w:r>
+        <w:rPr>
+          <w:color w:val="1F3B73"/>
+        </w:rPr>
+        <w:t>Student Details</w:t>
+      </w:r>
+    </w:p>
+    <w:tbl>
+      <w:tblPr>
+        <w:tblStyle w:val="LightGrid-Accent1"/>
+        <w:tblW w:type="auto" w:w="0"/>
+        <w:jc w:val="center"/>
+        <w:tblLook w:firstColumn="1" w:firstRow="1" w:lastColumn="0" w:lastRow="0" w:noHBand="0" w:noVBand="1" w:val="04A0"/>
+      </w:tblPr>
+      <w:tblGrid>
+        <w:gridCol w:w="2880"/>
+        <w:gridCol w:w="2880"/>
+        <w:gridCol w:w="2880"/>
+      </w:tblGrid>
+      <w:tr>
+        <w:tc>
+          <w:tcPr>
+            <w:tcW w:type="dxa" w:w="3024"/>
+          </w:tcPr>
+          <w:p>
+            <w:r>
+              <w:rPr>
+                <w:b/>
+                <w:sz w:val="18"/>
+              </w:rPr>
+              <w:t>Name</w:t>
+            </w:r>
+          </w:p>
+        </w:tc>
+        <w:tc>
+          <w:tcPr>
+            <w:tcW w:type="dxa" w:w="2592"/>
+          </w:tcPr>
+          <w:p>
+            <w:r>
+              <w:rPr>
+                <w:b/>
+                <w:sz w:val="18"/>
+              </w:rPr>
+              <w:t>BITS ID</w:t>
+            </w:r>
+          </w:p>
+        </w:tc>
+        <w:tc>
+          <w:tcPr>
+            <w:tcW w:type="dxa" w:w="3456"/>
+          </w:tcPr>
+          <w:p>
+            <w:r>
+              <w:rPr>
+                <w:b/>
+                <w:sz w:val="18"/>
+              </w:rPr>
+              <w:t>Contribution</w:t>
+            </w:r>
+          </w:p>
+        </w:tc>
+      </w:tr>
+      <w:tr>
+        <w:tc>
+          <w:tcPr>
+            <w:tcW w:type="dxa" w:w="3024"/>
+          </w:tcPr>
+          <w:p>
+            <w:r>
+              <w:rPr>
+                <w:sz w:val="18"/>
+              </w:rPr>
+              <w:t>Sangitha V</w:t>
+            </w:r>
+          </w:p>
+        </w:tc>
+        <w:tc>
+          <w:tcPr>
+            <w:tcW w:type="dxa" w:w="2592"/>
+          </w:tcPr>
+          <w:p>
+            <w:r>
+              <w:rPr>
+                <w:sz w:val="18"/>
+              </w:rPr>
+              <w:t>2024BC26670</w:t>
+            </w:r>
+          </w:p>
+        </w:tc>
+        <w:tc>
+          <w:tcPr>
+            <w:tcW w:type="dxa" w:w="3456"/>
+          </w:tcPr>
+          <w:p>
+            <w:r>
+              <w:rPr>
+                <w:sz w:val="18"/>
+              </w:rPr>
+              <w:t>100%</w:t>
+            </w:r>
+          </w:p>
+        </w:tc>
+      </w:tr>
+    </w:tbl>
     <w:p>
       <w:pPr>
         <w:pStyle w:val="Heading1"/>
@@ -4345,6 +4454,34 @@
           </w:p>
         </w:tc>
       </w:tr>
+      <w:tr>
+        <w:tc>
+          <w:tcPr>
+            <w:tcW w:type="dxa" w:w="2304"/>
+          </w:tcPr>
+          <w:p>
+            <w:r>
+              <w:rPr>
+                <w:sz w:val="18"/>
+              </w:rPr>
+              <w:t>Colab notebook</w:t>
+            </w:r>
+          </w:p>
+        </w:tc>
+        <w:tc>
+          <w:tcPr>
+            <w:tcW w:type="dxa" w:w="6768"/>
+          </w:tcPr>
+          <w:p>
+            <w:r>
+              <w:rPr>
+                <w:sz w:val="18"/>
+              </w:rPr>
+              <w:t>https://colab.research.google.com/drive/13-BGEgvCadYBMlL7__BtckakJjmhy-rI?usp=sharing</w:t>
+            </w:r>
+          </w:p>
+        </w:tc>
+      </w:tr>
     </w:tbl>
     <w:p>
       <w:pPr>

</xml_diff>